<commit_message>
docs: refresh stage2 guide artifact
</commit_message>
<xml_diff>
--- a/多模态代码生成Agent第二阶段实施与验收手册.docx
+++ b/多模态代码生成Agent第二阶段实施与验收手册.docx
@@ -2620,88 +2620,16 @@
           <w:color w:val="2E74B5"/>
           <w:sz w:val="26"/>
         </w:rPr>
-        <w:t>3.1 先推送并冻结第一阶段基线</w:t>
-      </w:r>
-    </w:p>
-    <w:p>
-      <w:pPr>
-        <w:spacing w:before="0" w:after="120" w:line="300" w:lineRule="auto"/>
-      </w:pPr>
-      <w:r>
-        <w:rPr>
-          <w:rFonts w:ascii="Calibri" w:hAnsi="Calibri" w:eastAsia="微软雅黑"/>
-          <w:b w:val="0"/>
-          <w:i w:val="0"/>
-          <w:color w:val="222222"/>
-          <w:sz w:val="22"/>
-        </w:rPr>
-        <w:t>负责人：成员 C当前本地提交 de3a004 尚未推送。所有第二阶段分支必须从同一个远端基线创建。</w:t>
+        <w:t>3.1 冻结第一阶段基线</w:t>
       </w:r>
     </w:p>
     <w:p>
       <w:pPr>
         <w:numPr>
-          <w:ilvl w:val="0"/>
-          <w:numId w:val="8"/>
+          <w:numId w:val="0"/>
         </w:numPr>
         <w:spacing w:before="0" w:after="80" w:line="300" w:lineRule="auto"/>
-      </w:pPr>
-      <w:r>
-        <w:rPr>
-          <w:rFonts w:ascii="Calibri" w:hAnsi="Calibri" w:eastAsia="微软雅黑"/>
-          <w:b w:val="0"/>
-          <w:i w:val="0"/>
-          <w:color w:val="222222"/>
-          <w:sz w:val="22"/>
-        </w:rPr>
-        <w:t>确认本地测试仍为 20/20，Docker 前后端容器健康。</w:t>
-      </w:r>
-    </w:p>
-    <w:p>
-      <w:pPr>
-        <w:numPr>
-          <w:ilvl w:val="0"/>
-          <w:numId w:val="8"/>
-        </w:numPr>
-        <w:spacing w:before="0" w:after="80" w:line="300" w:lineRule="auto"/>
-      </w:pPr>
-      <w:r>
-        <w:rPr>
-          <w:rFonts w:ascii="Calibri" w:hAnsi="Calibri" w:eastAsia="微软雅黑"/>
-          <w:b w:val="0"/>
-          <w:i w:val="0"/>
-          <w:color w:val="222222"/>
-          <w:sz w:val="22"/>
-        </w:rPr>
-        <w:t>网络恢复后执行 git push origin main，把 de3a004 推送到 GitHub。</w:t>
-      </w:r>
-    </w:p>
-    <w:p>
-      <w:pPr>
-        <w:numPr>
-          <w:ilvl w:val="0"/>
-          <w:numId w:val="8"/>
-        </w:numPr>
-        <w:spacing w:before="0" w:after="80" w:line="300" w:lineRule="auto"/>
-      </w:pPr>
-      <w:r>
-        <w:rPr>
-          <w:rFonts w:ascii="Calibri" w:hAnsi="Calibri" w:eastAsia="微软雅黑"/>
-          <w:b w:val="0"/>
-          <w:i w:val="0"/>
-          <w:color w:val="222222"/>
-          <w:sz w:val="22"/>
-        </w:rPr>
-        <w:t>在 GitHub 确认 main 已出现该提交，再创建 develop-stage2 分支。</w:t>
-      </w:r>
-    </w:p>
-    <w:p>
-      <w:pPr>
-        <w:numPr>
-          <w:ilvl w:val="0"/>
-          <w:numId w:val="8"/>
-        </w:numPr>
-        <w:spacing w:before="0" w:after="80" w:line="300" w:lineRule="auto"/>
+        <w:ind w:left="270" w:leftChars="0"/>
       </w:pPr>
       <w:r>
         <w:rPr>
@@ -2921,7 +2849,7 @@
       <w:pPr>
         <w:numPr>
           <w:ilvl w:val="0"/>
-          <w:numId w:val="9"/>
+          <w:numId w:val="8"/>
         </w:numPr>
         <w:tabs>
           <w:tab w:val="left" w:pos="540"/>
@@ -2943,7 +2871,7 @@
       <w:pPr>
         <w:numPr>
           <w:ilvl w:val="0"/>
-          <w:numId w:val="9"/>
+          <w:numId w:val="8"/>
         </w:numPr>
         <w:tabs>
           <w:tab w:val="left" w:pos="540"/>
@@ -2965,7 +2893,7 @@
       <w:pPr>
         <w:numPr>
           <w:ilvl w:val="0"/>
-          <w:numId w:val="9"/>
+          <w:numId w:val="8"/>
         </w:numPr>
         <w:tabs>
           <w:tab w:val="left" w:pos="540"/>
@@ -2987,7 +2915,7 @@
       <w:pPr>
         <w:numPr>
           <w:ilvl w:val="0"/>
-          <w:numId w:val="9"/>
+          <w:numId w:val="8"/>
         </w:numPr>
         <w:tabs>
           <w:tab w:val="left" w:pos="540"/>
@@ -4291,7 +4219,7 @@
       <w:pPr>
         <w:numPr>
           <w:ilvl w:val="0"/>
-          <w:numId w:val="10"/>
+          <w:numId w:val="9"/>
         </w:numPr>
         <w:tabs>
           <w:tab w:val="left" w:pos="540"/>
@@ -4313,7 +4241,7 @@
       <w:pPr>
         <w:numPr>
           <w:ilvl w:val="0"/>
-          <w:numId w:val="10"/>
+          <w:numId w:val="9"/>
         </w:numPr>
         <w:tabs>
           <w:tab w:val="left" w:pos="540"/>
@@ -4335,7 +4263,7 @@
       <w:pPr>
         <w:numPr>
           <w:ilvl w:val="0"/>
-          <w:numId w:val="10"/>
+          <w:numId w:val="9"/>
         </w:numPr>
         <w:tabs>
           <w:tab w:val="left" w:pos="540"/>
@@ -4357,7 +4285,7 @@
       <w:pPr>
         <w:numPr>
           <w:ilvl w:val="0"/>
-          <w:numId w:val="10"/>
+          <w:numId w:val="9"/>
         </w:numPr>
         <w:tabs>
           <w:tab w:val="left" w:pos="540"/>
@@ -4379,7 +4307,7 @@
       <w:pPr>
         <w:numPr>
           <w:ilvl w:val="0"/>
-          <w:numId w:val="10"/>
+          <w:numId w:val="9"/>
         </w:numPr>
         <w:tabs>
           <w:tab w:val="left" w:pos="540"/>
@@ -5157,18 +5085,27 @@
           <w:color w:val="222222"/>
           <w:sz w:val="22"/>
         </w:rPr>
-        <w:t>让 C、D 输出的数据有固定保存位置，让 A 有真实接口可接。此阶段先返回空结构也可以，但字段不能再变。</w:t>
+        <w:t>让 C、D 输出的数据有固定保存位置，让 A 有真实接口可接。此阶段先返回空结构也可以，但字段不能再变</w:t>
+      </w:r>
+      <w:bookmarkStart w:id="0" w:name="_GoBack"/>
+      <w:bookmarkEnd w:id="0"/>
+      <w:r>
+        <w:rPr>
+          <w:rFonts w:ascii="Calibri" w:hAnsi="Calibri" w:eastAsia="微软雅黑"/>
+          <w:b w:val="0"/>
+          <w:i w:val="0"/>
+          <w:color w:val="222222"/>
+          <w:sz w:val="22"/>
+        </w:rPr>
+        <w:t>。</w:t>
       </w:r>
     </w:p>
     <w:p>
       <w:pPr>
         <w:numPr>
           <w:ilvl w:val="0"/>
-          <w:numId w:val="11"/>
+          <w:numId w:val="10"/>
         </w:numPr>
-        <w:tabs>
-          <w:tab w:val="left" w:pos="540"/>
-        </w:tabs>
         <w:spacing w:before="0" w:after="80" w:line="300" w:lineRule="auto"/>
       </w:pPr>
       <w:r>
@@ -5186,11 +5123,8 @@
       <w:pPr>
         <w:numPr>
           <w:ilvl w:val="0"/>
-          <w:numId w:val="11"/>
+          <w:numId w:val="10"/>
         </w:numPr>
-        <w:tabs>
-          <w:tab w:val="left" w:pos="540"/>
-        </w:tabs>
         <w:spacing w:before="0" w:after="80" w:line="300" w:lineRule="auto"/>
       </w:pPr>
       <w:r>
@@ -5208,11 +5142,8 @@
       <w:pPr>
         <w:numPr>
           <w:ilvl w:val="0"/>
-          <w:numId w:val="11"/>
+          <w:numId w:val="10"/>
         </w:numPr>
-        <w:tabs>
-          <w:tab w:val="left" w:pos="540"/>
-        </w:tabs>
         <w:spacing w:before="0" w:after="80" w:line="300" w:lineRule="auto"/>
       </w:pPr>
       <w:r>
@@ -5230,11 +5161,8 @@
       <w:pPr>
         <w:numPr>
           <w:ilvl w:val="0"/>
-          <w:numId w:val="11"/>
+          <w:numId w:val="10"/>
         </w:numPr>
-        <w:tabs>
-          <w:tab w:val="left" w:pos="540"/>
-        </w:tabs>
         <w:spacing w:before="0" w:after="80" w:line="300" w:lineRule="auto"/>
       </w:pPr>
       <w:r>
@@ -5252,11 +5180,8 @@
       <w:pPr>
         <w:numPr>
           <w:ilvl w:val="0"/>
-          <w:numId w:val="11"/>
+          <w:numId w:val="10"/>
         </w:numPr>
-        <w:tabs>
-          <w:tab w:val="left" w:pos="540"/>
-        </w:tabs>
         <w:spacing w:before="0" w:after="80" w:line="300" w:lineRule="auto"/>
       </w:pPr>
       <w:r>
@@ -5274,11 +5199,8 @@
       <w:pPr>
         <w:numPr>
           <w:ilvl w:val="0"/>
-          <w:numId w:val="11"/>
+          <w:numId w:val="10"/>
         </w:numPr>
-        <w:tabs>
-          <w:tab w:val="left" w:pos="540"/>
-        </w:tabs>
         <w:spacing w:before="0" w:after="80" w:line="300" w:lineRule="auto"/>
       </w:pPr>
       <w:r>
@@ -6202,7 +6124,7 @@
       <w:pPr>
         <w:numPr>
           <w:ilvl w:val="0"/>
-          <w:numId w:val="12"/>
+          <w:numId w:val="11"/>
         </w:numPr>
         <w:tabs>
           <w:tab w:val="left" w:pos="540"/>
@@ -6224,7 +6146,7 @@
       <w:pPr>
         <w:numPr>
           <w:ilvl w:val="0"/>
-          <w:numId w:val="12"/>
+          <w:numId w:val="11"/>
         </w:numPr>
         <w:tabs>
           <w:tab w:val="left" w:pos="540"/>
@@ -6246,7 +6168,7 @@
       <w:pPr>
         <w:numPr>
           <w:ilvl w:val="0"/>
-          <w:numId w:val="12"/>
+          <w:numId w:val="11"/>
         </w:numPr>
         <w:tabs>
           <w:tab w:val="left" w:pos="540"/>
@@ -6268,7 +6190,7 @@
       <w:pPr>
         <w:numPr>
           <w:ilvl w:val="0"/>
-          <w:numId w:val="12"/>
+          <w:numId w:val="11"/>
         </w:numPr>
         <w:tabs>
           <w:tab w:val="left" w:pos="540"/>
@@ -6290,7 +6212,7 @@
       <w:pPr>
         <w:numPr>
           <w:ilvl w:val="0"/>
-          <w:numId w:val="12"/>
+          <w:numId w:val="11"/>
         </w:numPr>
         <w:tabs>
           <w:tab w:val="left" w:pos="540"/>
@@ -6312,7 +6234,7 @@
       <w:pPr>
         <w:numPr>
           <w:ilvl w:val="0"/>
-          <w:numId w:val="12"/>
+          <w:numId w:val="11"/>
         </w:numPr>
         <w:tabs>
           <w:tab w:val="left" w:pos="540"/>
@@ -6334,7 +6256,7 @@
       <w:pPr>
         <w:numPr>
           <w:ilvl w:val="0"/>
-          <w:numId w:val="12"/>
+          <w:numId w:val="11"/>
         </w:numPr>
         <w:tabs>
           <w:tab w:val="left" w:pos="540"/>
@@ -6356,7 +6278,7 @@
       <w:pPr>
         <w:numPr>
           <w:ilvl w:val="0"/>
-          <w:numId w:val="12"/>
+          <w:numId w:val="11"/>
         </w:numPr>
         <w:tabs>
           <w:tab w:val="left" w:pos="540"/>
@@ -6378,7 +6300,7 @@
       <w:pPr>
         <w:numPr>
           <w:ilvl w:val="0"/>
-          <w:numId w:val="12"/>
+          <w:numId w:val="11"/>
         </w:numPr>
         <w:tabs>
           <w:tab w:val="left" w:pos="540"/>
@@ -6400,7 +6322,7 @@
       <w:pPr>
         <w:numPr>
           <w:ilvl w:val="0"/>
-          <w:numId w:val="12"/>
+          <w:numId w:val="11"/>
         </w:numPr>
         <w:tabs>
           <w:tab w:val="left" w:pos="540"/>
@@ -7053,7 +6975,7 @@
       <w:pPr>
         <w:numPr>
           <w:ilvl w:val="0"/>
-          <w:numId w:val="13"/>
+          <w:numId w:val="12"/>
         </w:numPr>
         <w:tabs>
           <w:tab w:val="left" w:pos="540"/>
@@ -7075,7 +6997,7 @@
       <w:pPr>
         <w:numPr>
           <w:ilvl w:val="0"/>
-          <w:numId w:val="13"/>
+          <w:numId w:val="12"/>
         </w:numPr>
         <w:tabs>
           <w:tab w:val="left" w:pos="540"/>
@@ -7097,7 +7019,7 @@
       <w:pPr>
         <w:numPr>
           <w:ilvl w:val="0"/>
-          <w:numId w:val="13"/>
+          <w:numId w:val="12"/>
         </w:numPr>
         <w:tabs>
           <w:tab w:val="left" w:pos="540"/>
@@ -7119,7 +7041,7 @@
       <w:pPr>
         <w:numPr>
           <w:ilvl w:val="0"/>
-          <w:numId w:val="13"/>
+          <w:numId w:val="12"/>
         </w:numPr>
         <w:tabs>
           <w:tab w:val="left" w:pos="540"/>
@@ -7141,7 +7063,7 @@
       <w:pPr>
         <w:numPr>
           <w:ilvl w:val="0"/>
-          <w:numId w:val="13"/>
+          <w:numId w:val="12"/>
         </w:numPr>
         <w:tabs>
           <w:tab w:val="left" w:pos="540"/>
@@ -7163,7 +7085,7 @@
       <w:pPr>
         <w:numPr>
           <w:ilvl w:val="0"/>
-          <w:numId w:val="13"/>
+          <w:numId w:val="12"/>
         </w:numPr>
         <w:tabs>
           <w:tab w:val="left" w:pos="540"/>
@@ -7185,7 +7107,7 @@
       <w:pPr>
         <w:numPr>
           <w:ilvl w:val="0"/>
-          <w:numId w:val="13"/>
+          <w:numId w:val="12"/>
         </w:numPr>
         <w:tabs>
           <w:tab w:val="left" w:pos="540"/>
@@ -7207,7 +7129,7 @@
       <w:pPr>
         <w:numPr>
           <w:ilvl w:val="0"/>
-          <w:numId w:val="13"/>
+          <w:numId w:val="12"/>
         </w:numPr>
         <w:tabs>
           <w:tab w:val="left" w:pos="540"/>
@@ -7229,7 +7151,7 @@
       <w:pPr>
         <w:numPr>
           <w:ilvl w:val="0"/>
-          <w:numId w:val="13"/>
+          <w:numId w:val="12"/>
         </w:numPr>
         <w:tabs>
           <w:tab w:val="left" w:pos="540"/>
@@ -7763,7 +7685,7 @@
       <w:pPr>
         <w:numPr>
           <w:ilvl w:val="0"/>
-          <w:numId w:val="14"/>
+          <w:numId w:val="13"/>
         </w:numPr>
         <w:tabs>
           <w:tab w:val="left" w:pos="540"/>
@@ -7785,7 +7707,7 @@
       <w:pPr>
         <w:numPr>
           <w:ilvl w:val="0"/>
-          <w:numId w:val="14"/>
+          <w:numId w:val="13"/>
         </w:numPr>
         <w:tabs>
           <w:tab w:val="left" w:pos="540"/>
@@ -7807,7 +7729,7 @@
       <w:pPr>
         <w:numPr>
           <w:ilvl w:val="0"/>
-          <w:numId w:val="14"/>
+          <w:numId w:val="13"/>
         </w:numPr>
         <w:tabs>
           <w:tab w:val="left" w:pos="540"/>
@@ -7829,7 +7751,7 @@
       <w:pPr>
         <w:numPr>
           <w:ilvl w:val="0"/>
-          <w:numId w:val="14"/>
+          <w:numId w:val="13"/>
         </w:numPr>
         <w:tabs>
           <w:tab w:val="left" w:pos="540"/>
@@ -7851,7 +7773,7 @@
       <w:pPr>
         <w:numPr>
           <w:ilvl w:val="0"/>
-          <w:numId w:val="14"/>
+          <w:numId w:val="13"/>
         </w:numPr>
         <w:tabs>
           <w:tab w:val="left" w:pos="540"/>
@@ -7873,7 +7795,7 @@
       <w:pPr>
         <w:numPr>
           <w:ilvl w:val="0"/>
-          <w:numId w:val="14"/>
+          <w:numId w:val="13"/>
         </w:numPr>
         <w:tabs>
           <w:tab w:val="left" w:pos="540"/>
@@ -7895,7 +7817,7 @@
       <w:pPr>
         <w:numPr>
           <w:ilvl w:val="0"/>
-          <w:numId w:val="14"/>
+          <w:numId w:val="13"/>
         </w:numPr>
         <w:tabs>
           <w:tab w:val="left" w:pos="540"/>
@@ -8027,7 +7949,7 @@
       <w:pPr>
         <w:numPr>
           <w:ilvl w:val="0"/>
-          <w:numId w:val="15"/>
+          <w:numId w:val="14"/>
         </w:numPr>
         <w:tabs>
           <w:tab w:val="left" w:pos="540"/>
@@ -8049,7 +7971,7 @@
       <w:pPr>
         <w:numPr>
           <w:ilvl w:val="0"/>
-          <w:numId w:val="15"/>
+          <w:numId w:val="14"/>
         </w:numPr>
         <w:tabs>
           <w:tab w:val="left" w:pos="540"/>
@@ -8071,7 +7993,7 @@
       <w:pPr>
         <w:numPr>
           <w:ilvl w:val="0"/>
-          <w:numId w:val="15"/>
+          <w:numId w:val="14"/>
         </w:numPr>
         <w:tabs>
           <w:tab w:val="left" w:pos="540"/>
@@ -8093,7 +8015,7 @@
       <w:pPr>
         <w:numPr>
           <w:ilvl w:val="0"/>
-          <w:numId w:val="15"/>
+          <w:numId w:val="14"/>
         </w:numPr>
         <w:tabs>
           <w:tab w:val="left" w:pos="540"/>
@@ -8115,7 +8037,7 @@
       <w:pPr>
         <w:numPr>
           <w:ilvl w:val="0"/>
-          <w:numId w:val="15"/>
+          <w:numId w:val="14"/>
         </w:numPr>
         <w:tabs>
           <w:tab w:val="left" w:pos="540"/>
@@ -8137,7 +8059,7 @@
       <w:pPr>
         <w:numPr>
           <w:ilvl w:val="0"/>
-          <w:numId w:val="15"/>
+          <w:numId w:val="14"/>
         </w:numPr>
         <w:tabs>
           <w:tab w:val="left" w:pos="540"/>
@@ -8159,7 +8081,7 @@
       <w:pPr>
         <w:numPr>
           <w:ilvl w:val="0"/>
-          <w:numId w:val="15"/>
+          <w:numId w:val="14"/>
         </w:numPr>
         <w:tabs>
           <w:tab w:val="left" w:pos="540"/>
@@ -8181,7 +8103,7 @@
       <w:pPr>
         <w:numPr>
           <w:ilvl w:val="0"/>
-          <w:numId w:val="15"/>
+          <w:numId w:val="14"/>
         </w:numPr>
         <w:tabs>
           <w:tab w:val="left" w:pos="540"/>
@@ -8715,7 +8637,7 @@
       <w:pPr>
         <w:numPr>
           <w:ilvl w:val="0"/>
-          <w:numId w:val="16"/>
+          <w:numId w:val="15"/>
         </w:numPr>
         <w:tabs>
           <w:tab w:val="left" w:pos="540"/>
@@ -8737,7 +8659,7 @@
       <w:pPr>
         <w:numPr>
           <w:ilvl w:val="0"/>
-          <w:numId w:val="16"/>
+          <w:numId w:val="15"/>
         </w:numPr>
         <w:tabs>
           <w:tab w:val="left" w:pos="540"/>
@@ -8759,7 +8681,7 @@
       <w:pPr>
         <w:numPr>
           <w:ilvl w:val="0"/>
-          <w:numId w:val="16"/>
+          <w:numId w:val="15"/>
         </w:numPr>
         <w:tabs>
           <w:tab w:val="left" w:pos="540"/>
@@ -8781,7 +8703,7 @@
       <w:pPr>
         <w:numPr>
           <w:ilvl w:val="0"/>
-          <w:numId w:val="16"/>
+          <w:numId w:val="15"/>
         </w:numPr>
         <w:tabs>
           <w:tab w:val="left" w:pos="540"/>
@@ -8803,7 +8725,7 @@
       <w:pPr>
         <w:numPr>
           <w:ilvl w:val="0"/>
-          <w:numId w:val="16"/>
+          <w:numId w:val="15"/>
         </w:numPr>
         <w:tabs>
           <w:tab w:val="left" w:pos="540"/>
@@ -8825,7 +8747,7 @@
       <w:pPr>
         <w:numPr>
           <w:ilvl w:val="0"/>
-          <w:numId w:val="16"/>
+          <w:numId w:val="15"/>
         </w:numPr>
         <w:tabs>
           <w:tab w:val="left" w:pos="540"/>
@@ -12440,7 +12362,7 @@
       <w:pPr>
         <w:numPr>
           <w:ilvl w:val="0"/>
-          <w:numId w:val="17"/>
+          <w:numId w:val="16"/>
         </w:numPr>
         <w:tabs>
           <w:tab w:val="left" w:pos="540"/>
@@ -12462,7 +12384,7 @@
       <w:pPr>
         <w:numPr>
           <w:ilvl w:val="0"/>
-          <w:numId w:val="17"/>
+          <w:numId w:val="16"/>
         </w:numPr>
         <w:tabs>
           <w:tab w:val="left" w:pos="540"/>
@@ -12484,7 +12406,7 @@
       <w:pPr>
         <w:numPr>
           <w:ilvl w:val="0"/>
-          <w:numId w:val="17"/>
+          <w:numId w:val="16"/>
         </w:numPr>
         <w:tabs>
           <w:tab w:val="left" w:pos="540"/>
@@ -12506,7 +12428,7 @@
       <w:pPr>
         <w:numPr>
           <w:ilvl w:val="0"/>
-          <w:numId w:val="17"/>
+          <w:numId w:val="16"/>
         </w:numPr>
         <w:tabs>
           <w:tab w:val="left" w:pos="540"/>
@@ -12528,7 +12450,7 @@
       <w:pPr>
         <w:numPr>
           <w:ilvl w:val="0"/>
-          <w:numId w:val="17"/>
+          <w:numId w:val="16"/>
         </w:numPr>
         <w:tabs>
           <w:tab w:val="left" w:pos="540"/>
@@ -12550,7 +12472,7 @@
       <w:pPr>
         <w:numPr>
           <w:ilvl w:val="0"/>
-          <w:numId w:val="17"/>
+          <w:numId w:val="16"/>
         </w:numPr>
         <w:tabs>
           <w:tab w:val="left" w:pos="540"/>
@@ -12572,7 +12494,7 @@
       <w:pPr>
         <w:numPr>
           <w:ilvl w:val="0"/>
-          <w:numId w:val="17"/>
+          <w:numId w:val="16"/>
         </w:numPr>
         <w:tabs>
           <w:tab w:val="left" w:pos="540"/>
@@ -12594,7 +12516,7 @@
       <w:pPr>
         <w:numPr>
           <w:ilvl w:val="0"/>
-          <w:numId w:val="17"/>
+          <w:numId w:val="16"/>
         </w:numPr>
         <w:tabs>
           <w:tab w:val="left" w:pos="540"/>
@@ -15744,7 +15666,7 @@
       <w:pPr>
         <w:numPr>
           <w:ilvl w:val="0"/>
-          <w:numId w:val="18"/>
+          <w:numId w:val="17"/>
         </w:numPr>
         <w:tabs>
           <w:tab w:val="left" w:pos="540"/>
@@ -15766,7 +15688,7 @@
       <w:pPr>
         <w:numPr>
           <w:ilvl w:val="0"/>
-          <w:numId w:val="18"/>
+          <w:numId w:val="17"/>
         </w:numPr>
         <w:tabs>
           <w:tab w:val="left" w:pos="540"/>
@@ -15788,7 +15710,7 @@
       <w:pPr>
         <w:numPr>
           <w:ilvl w:val="0"/>
-          <w:numId w:val="18"/>
+          <w:numId w:val="17"/>
         </w:numPr>
         <w:tabs>
           <w:tab w:val="left" w:pos="540"/>
@@ -15810,7 +15732,7 @@
       <w:pPr>
         <w:numPr>
           <w:ilvl w:val="0"/>
-          <w:numId w:val="18"/>
+          <w:numId w:val="17"/>
         </w:numPr>
         <w:tabs>
           <w:tab w:val="left" w:pos="540"/>
@@ -15832,7 +15754,7 @@
       <w:pPr>
         <w:numPr>
           <w:ilvl w:val="0"/>
-          <w:numId w:val="18"/>
+          <w:numId w:val="17"/>
         </w:numPr>
         <w:tabs>
           <w:tab w:val="left" w:pos="540"/>
@@ -15854,7 +15776,7 @@
       <w:pPr>
         <w:numPr>
           <w:ilvl w:val="0"/>
-          <w:numId w:val="18"/>
+          <w:numId w:val="17"/>
         </w:numPr>
         <w:tabs>
           <w:tab w:val="left" w:pos="540"/>
@@ -15876,7 +15798,7 @@
       <w:pPr>
         <w:numPr>
           <w:ilvl w:val="0"/>
-          <w:numId w:val="18"/>
+          <w:numId w:val="17"/>
         </w:numPr>
         <w:tabs>
           <w:tab w:val="left" w:pos="540"/>
@@ -15930,8 +15852,6 @@
         </w:rPr>
         <w:t>排期</w:t>
       </w:r>
-      <w:bookmarkStart w:id="0" w:name="_GoBack"/>
-      <w:bookmarkEnd w:id="0"/>
     </w:p>
     <w:tbl>
       <w:tblPr>
@@ -16288,6 +16208,12 @@
             <w:insideH w:val="single" w:color="B8C2CC" w:sz="6" w:space="0"/>
             <w:insideV w:val="single" w:color="B8C2CC" w:sz="6" w:space="0"/>
           </w:tblBorders>
+          <w:tblCellMar>
+            <w:top w:w="0" w:type="dxa"/>
+            <w:left w:w="108" w:type="dxa"/>
+            <w:bottom w:w="0" w:type="dxa"/>
+            <w:right w:w="108" w:type="dxa"/>
+          </w:tblCellMar>
         </w:tblPrEx>
         <w:trPr>
           <w:cantSplit/>
@@ -17734,7 +17660,7 @@
     </w:lvlOverride>
   </w:num>
   <w:num w:numId="8">
-    <w:abstractNumId w:val="7"/>
+    <w:abstractNumId w:val="6"/>
     <w:lvlOverride w:ilvl="0">
       <w:startOverride w:val="1"/>
     </w:lvlOverride>
@@ -17746,7 +17672,7 @@
     </w:lvlOverride>
   </w:num>
   <w:num w:numId="10">
-    <w:abstractNumId w:val="6"/>
+    <w:abstractNumId w:val="7"/>
     <w:lvlOverride w:ilvl="0">
       <w:startOverride w:val="1"/>
     </w:lvlOverride>
@@ -17788,12 +17714,6 @@
     </w:lvlOverride>
   </w:num>
   <w:num w:numId="17">
-    <w:abstractNumId w:val="7"/>
-    <w:lvlOverride w:ilvl="0">
-      <w:startOverride w:val="1"/>
-    </w:lvlOverride>
-  </w:num>
-  <w:num w:numId="18">
     <w:abstractNumId w:val="6"/>
     <w:lvlOverride w:ilvl="0">
       <w:startOverride w:val="1"/>
@@ -17845,7 +17765,7 @@
     <w:lsdException w:uiPriority="99" w:name="footnote text"/>
     <w:lsdException w:uiPriority="99" w:name="annotation text"/>
     <w:lsdException w:uiPriority="99" w:semiHidden="0" w:name="header"/>
-    <w:lsdException w:uiPriority="99" w:semiHidden="0" w:name="footer"/>
+    <w:lsdException w:qFormat="1" w:uiPriority="99" w:semiHidden="0" w:name="footer"/>
     <w:lsdException w:uiPriority="99" w:name="index heading"/>
     <w:lsdException w:qFormat="1" w:uiPriority="35" w:name="caption"/>
     <w:lsdException w:uiPriority="99" w:name="table of figures"/>
@@ -17858,21 +17778,21 @@
     <w:lsdException w:uiPriority="99" w:name="endnote reference"/>
     <w:lsdException w:uiPriority="99" w:name="endnote text"/>
     <w:lsdException w:uiPriority="99" w:name="table of authorities"/>
-    <w:lsdException w:uiPriority="99" w:semiHidden="0" w:name="macro"/>
+    <w:lsdException w:qFormat="1" w:uiPriority="99" w:semiHidden="0" w:name="macro"/>
     <w:lsdException w:uiPriority="99" w:name="toa heading"/>
-    <w:lsdException w:uiPriority="99" w:semiHidden="0" w:name="List"/>
-    <w:lsdException w:uiPriority="99" w:semiHidden="0" w:name="List Bullet"/>
-    <w:lsdException w:uiPriority="99" w:semiHidden="0" w:name="List Number"/>
-    <w:lsdException w:uiPriority="99" w:semiHidden="0" w:name="List 2"/>
-    <w:lsdException w:uiPriority="99" w:semiHidden="0" w:name="List 3"/>
+    <w:lsdException w:qFormat="1" w:uiPriority="99" w:semiHidden="0" w:name="List"/>
+    <w:lsdException w:qFormat="1" w:uiPriority="99" w:semiHidden="0" w:name="List Bullet"/>
+    <w:lsdException w:qFormat="1" w:uiPriority="99" w:semiHidden="0" w:name="List Number"/>
+    <w:lsdException w:qFormat="1" w:uiPriority="99" w:semiHidden="0" w:name="List 2"/>
+    <w:lsdException w:qFormat="1" w:uiPriority="99" w:semiHidden="0" w:name="List 3"/>
     <w:lsdException w:uiPriority="99" w:name="List 4"/>
     <w:lsdException w:uiPriority="99" w:name="List 5"/>
-    <w:lsdException w:uiPriority="99" w:semiHidden="0" w:name="List Bullet 2"/>
-    <w:lsdException w:uiPriority="99" w:semiHidden="0" w:name="List Bullet 3"/>
+    <w:lsdException w:qFormat="1" w:uiPriority="99" w:semiHidden="0" w:name="List Bullet 2"/>
+    <w:lsdException w:qFormat="1" w:uiPriority="99" w:semiHidden="0" w:name="List Bullet 3"/>
     <w:lsdException w:uiPriority="99" w:name="List Bullet 4"/>
     <w:lsdException w:uiPriority="99" w:name="List Bullet 5"/>
-    <w:lsdException w:uiPriority="99" w:semiHidden="0" w:name="List Number 2"/>
-    <w:lsdException w:uiPriority="99" w:semiHidden="0" w:name="List Number 3"/>
+    <w:lsdException w:qFormat="1" w:uiPriority="99" w:semiHidden="0" w:name="List Number 2"/>
+    <w:lsdException w:qFormat="1" w:uiPriority="99" w:semiHidden="0" w:name="List Number 3"/>
     <w:lsdException w:uiPriority="99" w:name="List Number 4"/>
     <w:lsdException w:uiPriority="99" w:name="List Number 5"/>
     <w:lsdException w:qFormat="1" w:unhideWhenUsed="0" w:uiPriority="10" w:semiHidden="0" w:name="Title"/>
@@ -17881,8 +17801,8 @@
     <w:lsdException w:qFormat="1" w:uiPriority="1" w:name="Default Paragraph Font"/>
     <w:lsdException w:qFormat="1" w:uiPriority="99" w:semiHidden="0" w:name="Body Text"/>
     <w:lsdException w:uiPriority="99" w:name="Body Text Indent"/>
-    <w:lsdException w:uiPriority="99" w:semiHidden="0" w:name="List Continue"/>
-    <w:lsdException w:uiPriority="99" w:semiHidden="0" w:name="List Continue 2"/>
+    <w:lsdException w:qFormat="1" w:uiPriority="99" w:semiHidden="0" w:name="List Continue"/>
+    <w:lsdException w:qFormat="1" w:uiPriority="99" w:semiHidden="0" w:name="List Continue 2"/>
     <w:lsdException w:uiPriority="99" w:semiHidden="0" w:name="List Continue 3"/>
     <w:lsdException w:uiPriority="99" w:name="List Continue 4"/>
     <w:lsdException w:uiPriority="99" w:name="List Continue 5"/>
@@ -17961,107 +17881,107 @@
     <w:lsdException w:uiPriority="99" w:name="Table Web 2"/>
     <w:lsdException w:uiPriority="99" w:name="Table Web 3"/>
     <w:lsdException w:uiPriority="99" w:name="Balloon Text"/>
-    <w:lsdException w:unhideWhenUsed="0" w:uiPriority="59" w:semiHidden="0" w:name="Table Grid"/>
+    <w:lsdException w:qFormat="1" w:unhideWhenUsed="0" w:uiPriority="59" w:semiHidden="0" w:name="Table Grid"/>
     <w:lsdException w:uiPriority="99" w:name="Table Theme"/>
     <w:lsdException w:qFormat="1" w:unhideWhenUsed="0" w:uiPriority="1" w:semiHidden="0" w:name="No Spacing"/>
-    <w:lsdException w:unhideWhenUsed="0" w:uiPriority="60" w:semiHidden="0" w:name="Light Shading"/>
+    <w:lsdException w:qFormat="1" w:unhideWhenUsed="0" w:uiPriority="60" w:semiHidden="0" w:name="Light Shading"/>
     <w:lsdException w:unhideWhenUsed="0" w:uiPriority="61" w:semiHidden="0" w:name="Light List"/>
-    <w:lsdException w:unhideWhenUsed="0" w:uiPriority="62" w:semiHidden="0" w:name="Light Grid"/>
+    <w:lsdException w:qFormat="1" w:unhideWhenUsed="0" w:uiPriority="62" w:semiHidden="0" w:name="Light Grid"/>
     <w:lsdException w:qFormat="1" w:unhideWhenUsed="0" w:uiPriority="63" w:semiHidden="0" w:name="Medium Shading 1"/>
-    <w:lsdException w:unhideWhenUsed="0" w:uiPriority="64" w:semiHidden="0" w:name="Medium Shading 2"/>
+    <w:lsdException w:qFormat="1" w:unhideWhenUsed="0" w:uiPriority="64" w:semiHidden="0" w:name="Medium Shading 2"/>
     <w:lsdException w:unhideWhenUsed="0" w:uiPriority="65" w:semiHidden="0" w:name="Medium List 1"/>
-    <w:lsdException w:unhideWhenUsed="0" w:uiPriority="66" w:semiHidden="0" w:name="Medium List 2"/>
-    <w:lsdException w:unhideWhenUsed="0" w:uiPriority="67" w:semiHidden="0" w:name="Medium Grid 1"/>
-    <w:lsdException w:unhideWhenUsed="0" w:uiPriority="68" w:semiHidden="0" w:name="Medium Grid 2"/>
-    <w:lsdException w:unhideWhenUsed="0" w:uiPriority="69" w:semiHidden="0" w:name="Medium Grid 3"/>
-    <w:lsdException w:unhideWhenUsed="0" w:uiPriority="70" w:semiHidden="0" w:name="Dark List"/>
-    <w:lsdException w:unhideWhenUsed="0" w:uiPriority="71" w:semiHidden="0" w:name="Colorful Shading"/>
-    <w:lsdException w:unhideWhenUsed="0" w:uiPriority="72" w:semiHidden="0" w:name="Colorful List"/>
+    <w:lsdException w:qFormat="1" w:unhideWhenUsed="0" w:uiPriority="66" w:semiHidden="0" w:name="Medium List 2"/>
+    <w:lsdException w:qFormat="1" w:unhideWhenUsed="0" w:uiPriority="67" w:semiHidden="0" w:name="Medium Grid 1"/>
+    <w:lsdException w:qFormat="1" w:unhideWhenUsed="0" w:uiPriority="68" w:semiHidden="0" w:name="Medium Grid 2"/>
+    <w:lsdException w:qFormat="1" w:unhideWhenUsed="0" w:uiPriority="69" w:semiHidden="0" w:name="Medium Grid 3"/>
+    <w:lsdException w:qFormat="1" w:unhideWhenUsed="0" w:uiPriority="70" w:semiHidden="0" w:name="Dark List"/>
+    <w:lsdException w:qFormat="1" w:unhideWhenUsed="0" w:uiPriority="71" w:semiHidden="0" w:name="Colorful Shading"/>
+    <w:lsdException w:qFormat="1" w:unhideWhenUsed="0" w:uiPriority="72" w:semiHidden="0" w:name="Colorful List"/>
     <w:lsdException w:unhideWhenUsed="0" w:uiPriority="73" w:semiHidden="0" w:name="Colorful Grid"/>
-    <w:lsdException w:unhideWhenUsed="0" w:uiPriority="60" w:semiHidden="0" w:name="Light Shading Accent 1"/>
+    <w:lsdException w:qFormat="1" w:unhideWhenUsed="0" w:uiPriority="60" w:semiHidden="0" w:name="Light Shading Accent 1"/>
     <w:lsdException w:unhideWhenUsed="0" w:uiPriority="61" w:semiHidden="0" w:name="Light List Accent 1"/>
-    <w:lsdException w:unhideWhenUsed="0" w:uiPriority="62" w:semiHidden="0" w:name="Light Grid Accent 1"/>
+    <w:lsdException w:qFormat="1" w:unhideWhenUsed="0" w:uiPriority="62" w:semiHidden="0" w:name="Light Grid Accent 1"/>
     <w:lsdException w:qFormat="1" w:unhideWhenUsed="0" w:uiPriority="63" w:semiHidden="0" w:name="Medium Shading 1 Accent 1"/>
-    <w:lsdException w:unhideWhenUsed="0" w:uiPriority="64" w:semiHidden="0" w:name="Medium Shading 2 Accent 1"/>
+    <w:lsdException w:qFormat="1" w:unhideWhenUsed="0" w:uiPriority="64" w:semiHidden="0" w:name="Medium Shading 2 Accent 1"/>
     <w:lsdException w:unhideWhenUsed="0" w:uiPriority="65" w:semiHidden="0" w:name="Medium List 1 Accent 1"/>
     <w:lsdException w:qFormat="1" w:unhideWhenUsed="0" w:uiPriority="34" w:semiHidden="0" w:name="List Paragraph"/>
     <w:lsdException w:qFormat="1" w:unhideWhenUsed="0" w:uiPriority="29" w:semiHidden="0" w:name="Quote"/>
     <w:lsdException w:qFormat="1" w:unhideWhenUsed="0" w:uiPriority="30" w:semiHidden="0" w:name="Intense Quote"/>
     <w:lsdException w:unhideWhenUsed="0" w:uiPriority="66" w:semiHidden="0" w:name="Medium List 2 Accent 1"/>
     <w:lsdException w:unhideWhenUsed="0" w:uiPriority="67" w:semiHidden="0" w:name="Medium Grid 1 Accent 1"/>
-    <w:lsdException w:unhideWhenUsed="0" w:uiPriority="68" w:semiHidden="0" w:name="Medium Grid 2 Accent 1"/>
+    <w:lsdException w:qFormat="1" w:unhideWhenUsed="0" w:uiPriority="68" w:semiHidden="0" w:name="Medium Grid 2 Accent 1"/>
     <w:lsdException w:unhideWhenUsed="0" w:uiPriority="69" w:semiHidden="0" w:name="Medium Grid 3 Accent 1"/>
-    <w:lsdException w:unhideWhenUsed="0" w:uiPriority="70" w:semiHidden="0" w:name="Dark List Accent 1"/>
+    <w:lsdException w:qFormat="1" w:unhideWhenUsed="0" w:uiPriority="70" w:semiHidden="0" w:name="Dark List Accent 1"/>
     <w:lsdException w:unhideWhenUsed="0" w:uiPriority="71" w:semiHidden="0" w:name="Colorful Shading Accent 1"/>
     <w:lsdException w:unhideWhenUsed="0" w:uiPriority="72" w:semiHidden="0" w:name="Colorful List Accent 1"/>
     <w:lsdException w:unhideWhenUsed="0" w:uiPriority="73" w:semiHidden="0" w:name="Colorful Grid Accent 1"/>
-    <w:lsdException w:unhideWhenUsed="0" w:uiPriority="60" w:semiHidden="0" w:name="Light Shading Accent 2"/>
-    <w:lsdException w:unhideWhenUsed="0" w:uiPriority="61" w:semiHidden="0" w:name="Light List Accent 2"/>
-    <w:lsdException w:unhideWhenUsed="0" w:uiPriority="62" w:semiHidden="0" w:name="Light Grid Accent 2"/>
+    <w:lsdException w:qFormat="1" w:unhideWhenUsed="0" w:uiPriority="60" w:semiHidden="0" w:name="Light Shading Accent 2"/>
+    <w:lsdException w:qFormat="1" w:unhideWhenUsed="0" w:uiPriority="61" w:semiHidden="0" w:name="Light List Accent 2"/>
+    <w:lsdException w:qFormat="1" w:unhideWhenUsed="0" w:uiPriority="62" w:semiHidden="0" w:name="Light Grid Accent 2"/>
     <w:lsdException w:qFormat="1" w:unhideWhenUsed="0" w:uiPriority="63" w:semiHidden="0" w:name="Medium Shading 1 Accent 2"/>
     <w:lsdException w:unhideWhenUsed="0" w:uiPriority="64" w:semiHidden="0" w:name="Medium Shading 2 Accent 2"/>
-    <w:lsdException w:unhideWhenUsed="0" w:uiPriority="65" w:semiHidden="0" w:name="Medium List 1 Accent 2"/>
-    <w:lsdException w:unhideWhenUsed="0" w:uiPriority="66" w:semiHidden="0" w:name="Medium List 2 Accent 2"/>
+    <w:lsdException w:qFormat="1" w:unhideWhenUsed="0" w:uiPriority="65" w:semiHidden="0" w:name="Medium List 1 Accent 2"/>
+    <w:lsdException w:qFormat="1" w:unhideWhenUsed="0" w:uiPriority="66" w:semiHidden="0" w:name="Medium List 2 Accent 2"/>
     <w:lsdException w:unhideWhenUsed="0" w:uiPriority="67" w:semiHidden="0" w:name="Medium Grid 1 Accent 2"/>
-    <w:lsdException w:unhideWhenUsed="0" w:uiPriority="68" w:semiHidden="0" w:name="Medium Grid 2 Accent 2"/>
+    <w:lsdException w:qFormat="1" w:unhideWhenUsed="0" w:uiPriority="68" w:semiHidden="0" w:name="Medium Grid 2 Accent 2"/>
     <w:lsdException w:unhideWhenUsed="0" w:uiPriority="69" w:semiHidden="0" w:name="Medium Grid 3 Accent 2"/>
-    <w:lsdException w:unhideWhenUsed="0" w:uiPriority="70" w:semiHidden="0" w:name="Dark List Accent 2"/>
-    <w:lsdException w:unhideWhenUsed="0" w:uiPriority="71" w:semiHidden="0" w:name="Colorful Shading Accent 2"/>
+    <w:lsdException w:qFormat="1" w:unhideWhenUsed="0" w:uiPriority="70" w:semiHidden="0" w:name="Dark List Accent 2"/>
+    <w:lsdException w:qFormat="1" w:unhideWhenUsed="0" w:uiPriority="71" w:semiHidden="0" w:name="Colorful Shading Accent 2"/>
     <w:lsdException w:qFormat="1" w:unhideWhenUsed="0" w:uiPriority="72" w:semiHidden="0" w:name="Colorful List Accent 2"/>
     <w:lsdException w:unhideWhenUsed="0" w:uiPriority="73" w:semiHidden="0" w:name="Colorful Grid Accent 2"/>
-    <w:lsdException w:unhideWhenUsed="0" w:uiPriority="60" w:semiHidden="0" w:name="Light Shading Accent 3"/>
-    <w:lsdException w:unhideWhenUsed="0" w:uiPriority="61" w:semiHidden="0" w:name="Light List Accent 3"/>
-    <w:lsdException w:unhideWhenUsed="0" w:uiPriority="62" w:semiHidden="0" w:name="Light Grid Accent 3"/>
-    <w:lsdException w:unhideWhenUsed="0" w:uiPriority="63" w:semiHidden="0" w:name="Medium Shading 1 Accent 3"/>
-    <w:lsdException w:unhideWhenUsed="0" w:uiPriority="64" w:semiHidden="0" w:name="Medium Shading 2 Accent 3"/>
-    <w:lsdException w:unhideWhenUsed="0" w:uiPriority="65" w:semiHidden="0" w:name="Medium List 1 Accent 3"/>
+    <w:lsdException w:qFormat="1" w:unhideWhenUsed="0" w:uiPriority="60" w:semiHidden="0" w:name="Light Shading Accent 3"/>
+    <w:lsdException w:qFormat="1" w:unhideWhenUsed="0" w:uiPriority="61" w:semiHidden="0" w:name="Light List Accent 3"/>
+    <w:lsdException w:qFormat="1" w:unhideWhenUsed="0" w:uiPriority="62" w:semiHidden="0" w:name="Light Grid Accent 3"/>
+    <w:lsdException w:qFormat="1" w:unhideWhenUsed="0" w:uiPriority="63" w:semiHidden="0" w:name="Medium Shading 1 Accent 3"/>
+    <w:lsdException w:qFormat="1" w:unhideWhenUsed="0" w:uiPriority="64" w:semiHidden="0" w:name="Medium Shading 2 Accent 3"/>
+    <w:lsdException w:qFormat="1" w:unhideWhenUsed="0" w:uiPriority="65" w:semiHidden="0" w:name="Medium List 1 Accent 3"/>
     <w:lsdException w:unhideWhenUsed="0" w:uiPriority="66" w:semiHidden="0" w:name="Medium List 2 Accent 3"/>
     <w:lsdException w:unhideWhenUsed="0" w:uiPriority="67" w:semiHidden="0" w:name="Medium Grid 1 Accent 3"/>
-    <w:lsdException w:unhideWhenUsed="0" w:uiPriority="68" w:semiHidden="0" w:name="Medium Grid 2 Accent 3"/>
-    <w:lsdException w:unhideWhenUsed="0" w:uiPriority="69" w:semiHidden="0" w:name="Medium Grid 3 Accent 3"/>
-    <w:lsdException w:unhideWhenUsed="0" w:uiPriority="70" w:semiHidden="0" w:name="Dark List Accent 3"/>
-    <w:lsdException w:unhideWhenUsed="0" w:uiPriority="71" w:semiHidden="0" w:name="Colorful Shading Accent 3"/>
+    <w:lsdException w:qFormat="1" w:unhideWhenUsed="0" w:uiPriority="68" w:semiHidden="0" w:name="Medium Grid 2 Accent 3"/>
+    <w:lsdException w:qFormat="1" w:unhideWhenUsed="0" w:uiPriority="69" w:semiHidden="0" w:name="Medium Grid 3 Accent 3"/>
+    <w:lsdException w:qFormat="1" w:unhideWhenUsed="0" w:uiPriority="70" w:semiHidden="0" w:name="Dark List Accent 3"/>
+    <w:lsdException w:qFormat="1" w:unhideWhenUsed="0" w:uiPriority="71" w:semiHidden="0" w:name="Colorful Shading Accent 3"/>
     <w:lsdException w:unhideWhenUsed="0" w:uiPriority="72" w:semiHidden="0" w:name="Colorful List Accent 3"/>
     <w:lsdException w:unhideWhenUsed="0" w:uiPriority="73" w:semiHidden="0" w:name="Colorful Grid Accent 3"/>
-    <w:lsdException w:unhideWhenUsed="0" w:uiPriority="60" w:semiHidden="0" w:name="Light Shading Accent 4"/>
-    <w:lsdException w:unhideWhenUsed="0" w:uiPriority="61" w:semiHidden="0" w:name="Light List Accent 4"/>
-    <w:lsdException w:unhideWhenUsed="0" w:uiPriority="62" w:semiHidden="0" w:name="Light Grid Accent 4"/>
+    <w:lsdException w:qFormat="1" w:unhideWhenUsed="0" w:uiPriority="60" w:semiHidden="0" w:name="Light Shading Accent 4"/>
+    <w:lsdException w:qFormat="1" w:unhideWhenUsed="0" w:uiPriority="61" w:semiHidden="0" w:name="Light List Accent 4"/>
+    <w:lsdException w:qFormat="1" w:unhideWhenUsed="0" w:uiPriority="62" w:semiHidden="0" w:name="Light Grid Accent 4"/>
     <w:lsdException w:qFormat="1" w:unhideWhenUsed="0" w:uiPriority="63" w:semiHidden="0" w:name="Medium Shading 1 Accent 4"/>
-    <w:lsdException w:unhideWhenUsed="0" w:uiPriority="64" w:semiHidden="0" w:name="Medium Shading 2 Accent 4"/>
+    <w:lsdException w:qFormat="1" w:unhideWhenUsed="0" w:uiPriority="64" w:semiHidden="0" w:name="Medium Shading 2 Accent 4"/>
     <w:lsdException w:unhideWhenUsed="0" w:uiPriority="65" w:semiHidden="0" w:name="Medium List 1 Accent 4"/>
-    <w:lsdException w:unhideWhenUsed="0" w:uiPriority="66" w:semiHidden="0" w:name="Medium List 2 Accent 4"/>
-    <w:lsdException w:unhideWhenUsed="0" w:uiPriority="67" w:semiHidden="0" w:name="Medium Grid 1 Accent 4"/>
+    <w:lsdException w:qFormat="1" w:unhideWhenUsed="0" w:uiPriority="66" w:semiHidden="0" w:name="Medium List 2 Accent 4"/>
+    <w:lsdException w:qFormat="1" w:unhideWhenUsed="0" w:uiPriority="67" w:semiHidden="0" w:name="Medium Grid 1 Accent 4"/>
     <w:lsdException w:unhideWhenUsed="0" w:uiPriority="68" w:semiHidden="0" w:name="Medium Grid 2 Accent 4"/>
-    <w:lsdException w:unhideWhenUsed="0" w:uiPriority="69" w:semiHidden="0" w:name="Medium Grid 3 Accent 4"/>
-    <w:lsdException w:unhideWhenUsed="0" w:uiPriority="70" w:semiHidden="0" w:name="Dark List Accent 4"/>
+    <w:lsdException w:qFormat="1" w:unhideWhenUsed="0" w:uiPriority="69" w:semiHidden="0" w:name="Medium Grid 3 Accent 4"/>
+    <w:lsdException w:qFormat="1" w:unhideWhenUsed="0" w:uiPriority="70" w:semiHidden="0" w:name="Dark List Accent 4"/>
     <w:lsdException w:unhideWhenUsed="0" w:uiPriority="71" w:semiHidden="0" w:name="Colorful Shading Accent 4"/>
     <w:lsdException w:unhideWhenUsed="0" w:uiPriority="72" w:semiHidden="0" w:name="Colorful List Accent 4"/>
     <w:lsdException w:unhideWhenUsed="0" w:uiPriority="73" w:semiHidden="0" w:name="Colorful Grid Accent 4"/>
     <w:lsdException w:unhideWhenUsed="0" w:uiPriority="60" w:semiHidden="0" w:name="Light Shading Accent 5"/>
-    <w:lsdException w:unhideWhenUsed="0" w:uiPriority="61" w:semiHidden="0" w:name="Light List Accent 5"/>
+    <w:lsdException w:qFormat="1" w:unhideWhenUsed="0" w:uiPriority="61" w:semiHidden="0" w:name="Light List Accent 5"/>
     <w:lsdException w:unhideWhenUsed="0" w:uiPriority="62" w:semiHidden="0" w:name="Light Grid Accent 5"/>
     <w:lsdException w:qFormat="1" w:unhideWhenUsed="0" w:uiPriority="63" w:semiHidden="0" w:name="Medium Shading 1 Accent 5"/>
-    <w:lsdException w:unhideWhenUsed="0" w:uiPriority="64" w:semiHidden="0" w:name="Medium Shading 2 Accent 5"/>
+    <w:lsdException w:qFormat="1" w:unhideWhenUsed="0" w:uiPriority="64" w:semiHidden="0" w:name="Medium Shading 2 Accent 5"/>
     <w:lsdException w:unhideWhenUsed="0" w:uiPriority="65" w:semiHidden="0" w:name="Medium List 1 Accent 5"/>
-    <w:lsdException w:unhideWhenUsed="0" w:uiPriority="66" w:semiHidden="0" w:name="Medium List 2 Accent 5"/>
+    <w:lsdException w:qFormat="1" w:unhideWhenUsed="0" w:uiPriority="66" w:semiHidden="0" w:name="Medium List 2 Accent 5"/>
     <w:lsdException w:unhideWhenUsed="0" w:uiPriority="67" w:semiHidden="0" w:name="Medium Grid 1 Accent 5"/>
-    <w:lsdException w:unhideWhenUsed="0" w:uiPriority="68" w:semiHidden="0" w:name="Medium Grid 2 Accent 5"/>
-    <w:lsdException w:unhideWhenUsed="0" w:uiPriority="69" w:semiHidden="0" w:name="Medium Grid 3 Accent 5"/>
-    <w:lsdException w:unhideWhenUsed="0" w:uiPriority="70" w:semiHidden="0" w:name="Dark List Accent 5"/>
+    <w:lsdException w:qFormat="1" w:unhideWhenUsed="0" w:uiPriority="68" w:semiHidden="0" w:name="Medium Grid 2 Accent 5"/>
+    <w:lsdException w:qFormat="1" w:unhideWhenUsed="0" w:uiPriority="69" w:semiHidden="0" w:name="Medium Grid 3 Accent 5"/>
+    <w:lsdException w:qFormat="1" w:unhideWhenUsed="0" w:uiPriority="70" w:semiHidden="0" w:name="Dark List Accent 5"/>
     <w:lsdException w:qFormat="1" w:unhideWhenUsed="0" w:uiPriority="71" w:semiHidden="0" w:name="Colorful Shading Accent 5"/>
     <w:lsdException w:unhideWhenUsed="0" w:uiPriority="72" w:semiHidden="0" w:name="Colorful List Accent 5"/>
     <w:lsdException w:unhideWhenUsed="0" w:uiPriority="73" w:semiHidden="0" w:name="Colorful Grid Accent 5"/>
-    <w:lsdException w:unhideWhenUsed="0" w:uiPriority="60" w:semiHidden="0" w:name="Light Shading Accent 6"/>
-    <w:lsdException w:unhideWhenUsed="0" w:uiPriority="61" w:semiHidden="0" w:name="Light List Accent 6"/>
-    <w:lsdException w:unhideWhenUsed="0" w:uiPriority="62" w:semiHidden="0" w:name="Light Grid Accent 6"/>
+    <w:lsdException w:qFormat="1" w:unhideWhenUsed="0" w:uiPriority="60" w:semiHidden="0" w:name="Light Shading Accent 6"/>
+    <w:lsdException w:qFormat="1" w:unhideWhenUsed="0" w:uiPriority="61" w:semiHidden="0" w:name="Light List Accent 6"/>
+    <w:lsdException w:qFormat="1" w:unhideWhenUsed="0" w:uiPriority="62" w:semiHidden="0" w:name="Light Grid Accent 6"/>
     <w:lsdException w:unhideWhenUsed="0" w:uiPriority="63" w:semiHidden="0" w:name="Medium Shading 1 Accent 6"/>
     <w:lsdException w:unhideWhenUsed="0" w:uiPriority="64" w:semiHidden="0" w:name="Medium Shading 2 Accent 6"/>
-    <w:lsdException w:unhideWhenUsed="0" w:uiPriority="65" w:semiHidden="0" w:name="Medium List 1 Accent 6"/>
+    <w:lsdException w:qFormat="1" w:unhideWhenUsed="0" w:uiPriority="65" w:semiHidden="0" w:name="Medium List 1 Accent 6"/>
     <w:lsdException w:unhideWhenUsed="0" w:uiPriority="66" w:semiHidden="0" w:name="Medium List 2 Accent 6"/>
-    <w:lsdException w:unhideWhenUsed="0" w:uiPriority="67" w:semiHidden="0" w:name="Medium Grid 1 Accent 6"/>
+    <w:lsdException w:qFormat="1" w:unhideWhenUsed="0" w:uiPriority="67" w:semiHidden="0" w:name="Medium Grid 1 Accent 6"/>
     <w:lsdException w:unhideWhenUsed="0" w:uiPriority="68" w:semiHidden="0" w:name="Medium Grid 2 Accent 6"/>
-    <w:lsdException w:unhideWhenUsed="0" w:uiPriority="69" w:semiHidden="0" w:name="Medium Grid 3 Accent 6"/>
-    <w:lsdException w:unhideWhenUsed="0" w:uiPriority="70" w:semiHidden="0" w:name="Dark List Accent 6"/>
+    <w:lsdException w:qFormat="1" w:unhideWhenUsed="0" w:uiPriority="69" w:semiHidden="0" w:name="Medium Grid 3 Accent 6"/>
+    <w:lsdException w:qFormat="1" w:unhideWhenUsed="0" w:uiPriority="70" w:semiHidden="0" w:name="Dark List Accent 6"/>
     <w:lsdException w:unhideWhenUsed="0" w:uiPriority="71" w:semiHidden="0" w:name="Colorful Shading Accent 6"/>
     <w:lsdException w:unhideWhenUsed="0" w:uiPriority="72" w:semiHidden="0" w:name="Colorful List Accent 6"/>
     <w:lsdException w:unhideWhenUsed="0" w:uiPriority="73" w:semiHidden="0" w:name="Colorful Grid Accent 6"/>
@@ -18333,6 +18253,7 @@
     <w:name w:val="macro"/>
     <w:link w:val="147"/>
     <w:unhideWhenUsed/>
+    <w:qFormat/>
     <w:uiPriority w:val="99"/>
     <w:pPr>
       <w:tabs>
@@ -18357,6 +18278,7 @@
     <w:name w:val="List 3"/>
     <w:basedOn w:val="1"/>
     <w:unhideWhenUsed/>
+    <w:qFormat/>
     <w:uiPriority w:val="99"/>
     <w:pPr>
       <w:ind w:left="1080" w:hanging="360"/>
@@ -18367,6 +18289,7 @@
     <w:name w:val="List Number 2"/>
     <w:basedOn w:val="1"/>
     <w:unhideWhenUsed/>
+    <w:qFormat/>
     <w:uiPriority w:val="99"/>
     <w:pPr>
       <w:numPr>
@@ -18380,6 +18303,7 @@
     <w:name w:val="List Number"/>
     <w:basedOn w:val="1"/>
     <w:unhideWhenUsed/>
+    <w:qFormat/>
     <w:uiPriority w:val="99"/>
     <w:pPr>
       <w:numPr>
@@ -18417,6 +18341,7 @@
     <w:name w:val="List Bullet"/>
     <w:basedOn w:val="1"/>
     <w:unhideWhenUsed/>
+    <w:qFormat/>
     <w:uiPriority w:val="99"/>
     <w:pPr>
       <w:numPr>
@@ -18445,6 +18370,7 @@
     <w:name w:val="List Bullet 3"/>
     <w:basedOn w:val="1"/>
     <w:unhideWhenUsed/>
+    <w:qFormat/>
     <w:uiPriority w:val="99"/>
     <w:pPr>
       <w:numPr>
@@ -18469,6 +18395,7 @@
     <w:name w:val="List Number 3"/>
     <w:basedOn w:val="1"/>
     <w:unhideWhenUsed/>
+    <w:qFormat/>
     <w:uiPriority w:val="99"/>
     <w:pPr>
       <w:numPr>
@@ -18482,6 +18409,7 @@
     <w:name w:val="List 2"/>
     <w:basedOn w:val="1"/>
     <w:unhideWhenUsed/>
+    <w:qFormat/>
     <w:uiPriority w:val="99"/>
     <w:pPr>
       <w:ind w:left="720" w:hanging="360"/>
@@ -18492,6 +18420,7 @@
     <w:name w:val="List Continue"/>
     <w:basedOn w:val="1"/>
     <w:unhideWhenUsed/>
+    <w:qFormat/>
     <w:uiPriority w:val="99"/>
     <w:pPr>
       <w:spacing w:after="120"/>
@@ -18503,6 +18432,7 @@
     <w:name w:val="List Bullet 2"/>
     <w:basedOn w:val="1"/>
     <w:unhideWhenUsed/>
+    <w:qFormat/>
     <w:uiPriority w:val="99"/>
     <w:pPr>
       <w:numPr>
@@ -18517,6 +18447,7 @@
     <w:basedOn w:val="1"/>
     <w:link w:val="136"/>
     <w:unhideWhenUsed/>
+    <w:qFormat/>
     <w:uiPriority w:val="99"/>
     <w:pPr>
       <w:tabs>
@@ -18566,6 +18497,7 @@
     <w:name w:val="List"/>
     <w:basedOn w:val="1"/>
     <w:unhideWhenUsed/>
+    <w:qFormat/>
     <w:uiPriority w:val="99"/>
     <w:pPr>
       <w:ind w:left="360" w:hanging="360"/>
@@ -18587,6 +18519,7 @@
     <w:name w:val="List Continue 2"/>
     <w:basedOn w:val="1"/>
     <w:unhideWhenUsed/>
+    <w:qFormat/>
     <w:uiPriority w:val="99"/>
     <w:pPr>
       <w:spacing w:after="120"/>
@@ -18631,6 +18564,7 @@
   <w:style w:type="table" w:styleId="33">
     <w:name w:val="Table Grid"/>
     <w:basedOn w:val="32"/>
+    <w:qFormat/>
     <w:uiPriority w:val="59"/>
     <w:pPr>
       <w:spacing w:after="0" w:line="240" w:lineRule="auto"/>
@@ -18655,6 +18589,7 @@
   <w:style w:type="table" w:styleId="34">
     <w:name w:val="Light Shading"/>
     <w:basedOn w:val="32"/>
+    <w:qFormat/>
     <w:uiPriority w:val="60"/>
     <w:pPr>
       <w:spacing w:after="0" w:line="240" w:lineRule="auto"/>
@@ -18754,6 +18689,7 @@
   <w:style w:type="table" w:styleId="35">
     <w:name w:val="Light Shading Accent 1"/>
     <w:basedOn w:val="32"/>
+    <w:qFormat/>
     <w:uiPriority w:val="60"/>
     <w:pPr>
       <w:spacing w:after="0" w:line="240" w:lineRule="auto"/>
@@ -18853,6 +18789,7 @@
   <w:style w:type="table" w:styleId="36">
     <w:name w:val="Light Shading Accent 2"/>
     <w:basedOn w:val="32"/>
+    <w:qFormat/>
     <w:uiPriority w:val="60"/>
     <w:pPr>
       <w:spacing w:after="0" w:line="240" w:lineRule="auto"/>
@@ -18952,6 +18889,7 @@
   <w:style w:type="table" w:styleId="37">
     <w:name w:val="Light Shading Accent 3"/>
     <w:basedOn w:val="32"/>
+    <w:qFormat/>
     <w:uiPriority w:val="60"/>
     <w:pPr>
       <w:spacing w:after="0" w:line="240" w:lineRule="auto"/>
@@ -19051,6 +18989,7 @@
   <w:style w:type="table" w:styleId="38">
     <w:name w:val="Light Shading Accent 4"/>
     <w:basedOn w:val="32"/>
+    <w:qFormat/>
     <w:uiPriority w:val="60"/>
     <w:pPr>
       <w:spacing w:after="0" w:line="240" w:lineRule="auto"/>
@@ -19249,6 +19188,7 @@
   <w:style w:type="table" w:styleId="40">
     <w:name w:val="Light Shading Accent 6"/>
     <w:basedOn w:val="32"/>
+    <w:qFormat/>
     <w:uiPriority w:val="60"/>
     <w:pPr>
       <w:spacing w:after="0" w:line="240" w:lineRule="auto"/>
@@ -19534,6 +19474,7 @@
   <w:style w:type="table" w:styleId="43">
     <w:name w:val="Light List Accent 2"/>
     <w:basedOn w:val="32"/>
+    <w:qFormat/>
     <w:uiPriority w:val="61"/>
     <w:pPr>
       <w:spacing w:after="0" w:line="240" w:lineRule="auto"/>
@@ -19627,6 +19568,7 @@
   <w:style w:type="table" w:styleId="44">
     <w:name w:val="Light List Accent 3"/>
     <w:basedOn w:val="32"/>
+    <w:qFormat/>
     <w:uiPriority w:val="61"/>
     <w:pPr>
       <w:spacing w:after="0" w:line="240" w:lineRule="auto"/>
@@ -19720,6 +19662,7 @@
   <w:style w:type="table" w:styleId="45">
     <w:name w:val="Light List Accent 4"/>
     <w:basedOn w:val="32"/>
+    <w:qFormat/>
     <w:uiPriority w:val="61"/>
     <w:pPr>
       <w:spacing w:after="0" w:line="240" w:lineRule="auto"/>
@@ -19813,6 +19756,7 @@
   <w:style w:type="table" w:styleId="46">
     <w:name w:val="Light List Accent 5"/>
     <w:basedOn w:val="32"/>
+    <w:qFormat/>
     <w:uiPriority w:val="61"/>
     <w:pPr>
       <w:spacing w:after="0" w:line="240" w:lineRule="auto"/>
@@ -19906,6 +19850,7 @@
   <w:style w:type="table" w:styleId="47">
     <w:name w:val="Light List Accent 6"/>
     <w:basedOn w:val="32"/>
+    <w:qFormat/>
     <w:uiPriority w:val="61"/>
     <w:pPr>
       <w:spacing w:after="0" w:line="240" w:lineRule="auto"/>
@@ -19999,6 +19944,7 @@
   <w:style w:type="table" w:styleId="48">
     <w:name w:val="Light Grid"/>
     <w:basedOn w:val="32"/>
+    <w:qFormat/>
     <w:uiPriority w:val="62"/>
     <w:pPr>
       <w:spacing w:after="0" w:line="240" w:lineRule="auto"/>
@@ -20125,6 +20071,7 @@
   <w:style w:type="table" w:styleId="49">
     <w:name w:val="Light Grid Accent 1"/>
     <w:basedOn w:val="32"/>
+    <w:qFormat/>
     <w:uiPriority w:val="62"/>
     <w:pPr>
       <w:spacing w:after="0" w:line="240" w:lineRule="auto"/>
@@ -20251,6 +20198,7 @@
   <w:style w:type="table" w:styleId="50">
     <w:name w:val="Light Grid Accent 2"/>
     <w:basedOn w:val="32"/>
+    <w:qFormat/>
     <w:uiPriority w:val="62"/>
     <w:pPr>
       <w:spacing w:after="0" w:line="240" w:lineRule="auto"/>
@@ -20377,6 +20325,7 @@
   <w:style w:type="table" w:styleId="51">
     <w:name w:val="Light Grid Accent 3"/>
     <w:basedOn w:val="32"/>
+    <w:qFormat/>
     <w:uiPriority w:val="62"/>
     <w:pPr>
       <w:spacing w:after="0" w:line="240" w:lineRule="auto"/>
@@ -20503,6 +20452,7 @@
   <w:style w:type="table" w:styleId="52">
     <w:name w:val="Light Grid Accent 4"/>
     <w:basedOn w:val="32"/>
+    <w:qFormat/>
     <w:uiPriority w:val="62"/>
     <w:pPr>
       <w:spacing w:after="0" w:line="240" w:lineRule="auto"/>
@@ -20755,6 +20705,7 @@
   <w:style w:type="table" w:styleId="54">
     <w:name w:val="Light Grid Accent 6"/>
     <w:basedOn w:val="32"/>
+    <w:qFormat/>
     <w:uiPriority w:val="62"/>
     <w:pPr>
       <w:spacing w:after="0" w:line="240" w:lineRule="auto"/>
@@ -21205,6 +21156,7 @@
   <w:style w:type="table" w:styleId="58">
     <w:name w:val="Medium Shading 1 Accent 3"/>
     <w:basedOn w:val="32"/>
+    <w:qFormat/>
     <w:uiPriority w:val="63"/>
     <w:pPr>
       <w:spacing w:after="0" w:line="240" w:lineRule="auto"/>
@@ -21635,6 +21587,7 @@
   <w:style w:type="table" w:styleId="62">
     <w:name w:val="Medium Shading 2"/>
     <w:basedOn w:val="32"/>
+    <w:qFormat/>
     <w:uiPriority w:val="64"/>
     <w:pPr>
       <w:spacing w:after="0" w:line="240" w:lineRule="auto"/>
@@ -21800,6 +21753,7 @@
   <w:style w:type="table" w:styleId="63">
     <w:name w:val="Medium Shading 2 Accent 1"/>
     <w:basedOn w:val="32"/>
+    <w:qFormat/>
     <w:uiPriority w:val="64"/>
     <w:pPr>
       <w:spacing w:after="0" w:line="240" w:lineRule="auto"/>
@@ -22130,6 +22084,7 @@
   <w:style w:type="table" w:styleId="65">
     <w:name w:val="Medium Shading 2 Accent 3"/>
     <w:basedOn w:val="32"/>
+    <w:qFormat/>
     <w:uiPriority w:val="64"/>
     <w:pPr>
       <w:spacing w:after="0" w:line="240" w:lineRule="auto"/>
@@ -22295,6 +22250,7 @@
   <w:style w:type="table" w:styleId="66">
     <w:name w:val="Medium Shading 2 Accent 4"/>
     <w:basedOn w:val="32"/>
+    <w:qFormat/>
     <w:uiPriority w:val="64"/>
     <w:pPr>
       <w:spacing w:after="0" w:line="240" w:lineRule="auto"/>
@@ -22460,6 +22416,7 @@
   <w:style w:type="table" w:styleId="67">
     <w:name w:val="Medium Shading 2 Accent 5"/>
     <w:basedOn w:val="32"/>
+    <w:qFormat/>
     <w:uiPriority w:val="64"/>
     <w:pPr>
       <w:spacing w:after="0" w:line="240" w:lineRule="auto"/>
@@ -22970,6 +22927,7 @@
   <w:style w:type="table" w:styleId="71">
     <w:name w:val="Medium List 1 Accent 2"/>
     <w:basedOn w:val="32"/>
+    <w:qFormat/>
     <w:uiPriority w:val="65"/>
     <w:pPr>
       <w:spacing w:after="0" w:line="240" w:lineRule="auto"/>
@@ -23060,6 +23018,7 @@
   <w:style w:type="table" w:styleId="72">
     <w:name w:val="Medium List 1 Accent 3"/>
     <w:basedOn w:val="32"/>
+    <w:qFormat/>
     <w:uiPriority w:val="65"/>
     <w:pPr>
       <w:spacing w:after="0" w:line="240" w:lineRule="auto"/>
@@ -23330,6 +23289,7 @@
   <w:style w:type="table" w:styleId="75">
     <w:name w:val="Medium List 1 Accent 6"/>
     <w:basedOn w:val="32"/>
+    <w:qFormat/>
     <w:uiPriority w:val="65"/>
     <w:pPr>
       <w:spacing w:after="0" w:line="240" w:lineRule="auto"/>
@@ -23420,6 +23380,7 @@
   <w:style w:type="table" w:styleId="76">
     <w:name w:val="Medium List 2"/>
     <w:basedOn w:val="32"/>
+    <w:qFormat/>
     <w:uiPriority w:val="66"/>
     <w:pPr>
       <w:spacing w:after="0" w:line="240" w:lineRule="auto"/>
@@ -23678,6 +23639,7 @@
   <w:style w:type="table" w:styleId="78">
     <w:name w:val="Medium List 2 Accent 2"/>
     <w:basedOn w:val="32"/>
+    <w:qFormat/>
     <w:uiPriority w:val="66"/>
     <w:pPr>
       <w:spacing w:after="0" w:line="240" w:lineRule="auto"/>
@@ -23936,6 +23898,7 @@
   <w:style w:type="table" w:styleId="80">
     <w:name w:val="Medium List 2 Accent 4"/>
     <w:basedOn w:val="32"/>
+    <w:qFormat/>
     <w:uiPriority w:val="66"/>
     <w:pPr>
       <w:spacing w:after="0" w:line="240" w:lineRule="auto"/>
@@ -24065,6 +24028,7 @@
   <w:style w:type="table" w:styleId="81">
     <w:name w:val="Medium List 2 Accent 5"/>
     <w:basedOn w:val="32"/>
+    <w:qFormat/>
     <w:uiPriority w:val="66"/>
     <w:pPr>
       <w:spacing w:after="0" w:line="240" w:lineRule="auto"/>
@@ -24323,6 +24287,7 @@
   <w:style w:type="table" w:styleId="83">
     <w:name w:val="Medium Grid 1"/>
     <w:basedOn w:val="32"/>
+    <w:qFormat/>
     <w:uiPriority w:val="67"/>
     <w:pPr>
       <w:spacing w:after="0" w:line="240" w:lineRule="auto"/>
@@ -24599,6 +24564,7 @@
   <w:style w:type="table" w:styleId="87">
     <w:name w:val="Medium Grid 1 Accent 4"/>
     <w:basedOn w:val="32"/>
+    <w:qFormat/>
     <w:uiPriority w:val="67"/>
     <w:pPr>
       <w:spacing w:after="0" w:line="240" w:lineRule="auto"/>
@@ -24737,6 +24703,7 @@
   <w:style w:type="table" w:styleId="89">
     <w:name w:val="Medium Grid 1 Accent 6"/>
     <w:basedOn w:val="32"/>
+    <w:qFormat/>
     <w:uiPriority w:val="67"/>
     <w:pPr>
       <w:spacing w:after="0" w:line="240" w:lineRule="auto"/>
@@ -24806,6 +24773,7 @@
   <w:style w:type="table" w:styleId="90">
     <w:name w:val="Medium Grid 2"/>
     <w:basedOn w:val="32"/>
+    <w:qFormat/>
     <w:uiPriority w:val="68"/>
     <w:pPr>
       <w:spacing w:after="0" w:line="240" w:lineRule="auto"/>
@@ -24952,6 +24920,7 @@
   <w:style w:type="table" w:styleId="91">
     <w:name w:val="Medium Grid 2 Accent 1"/>
     <w:basedOn w:val="32"/>
+    <w:qFormat/>
     <w:uiPriority w:val="68"/>
     <w:pPr>
       <w:spacing w:after="0" w:line="240" w:lineRule="auto"/>
@@ -25098,6 +25067,7 @@
   <w:style w:type="table" w:styleId="92">
     <w:name w:val="Medium Grid 2 Accent 2"/>
     <w:basedOn w:val="32"/>
+    <w:qFormat/>
     <w:uiPriority w:val="68"/>
     <w:pPr>
       <w:spacing w:after="0" w:line="240" w:lineRule="auto"/>
@@ -25244,6 +25214,7 @@
   <w:style w:type="table" w:styleId="93">
     <w:name w:val="Medium Grid 2 Accent 3"/>
     <w:basedOn w:val="32"/>
+    <w:qFormat/>
     <w:uiPriority w:val="68"/>
     <w:pPr>
       <w:spacing w:after="0" w:line="240" w:lineRule="auto"/>
@@ -25536,6 +25507,7 @@
   <w:style w:type="table" w:styleId="95">
     <w:name w:val="Medium Grid 2 Accent 5"/>
     <w:basedOn w:val="32"/>
+    <w:qFormat/>
     <w:uiPriority w:val="68"/>
     <w:pPr>
       <w:spacing w:after="0" w:line="240" w:lineRule="auto"/>
@@ -25828,6 +25800,7 @@
   <w:style w:type="table" w:styleId="97">
     <w:name w:val="Medium Grid 3"/>
     <w:basedOn w:val="32"/>
+    <w:qFormat/>
     <w:uiPriority w:val="69"/>
     <w:pPr>
       <w:spacing w:after="0" w:line="240" w:lineRule="auto"/>
@@ -26299,6 +26272,7 @@
   <w:style w:type="table" w:styleId="100">
     <w:name w:val="Medium Grid 3 Accent 3"/>
     <w:basedOn w:val="32"/>
+    <w:qFormat/>
     <w:uiPriority w:val="69"/>
     <w:pPr>
       <w:spacing w:after="0" w:line="240" w:lineRule="auto"/>
@@ -26456,6 +26430,7 @@
   <w:style w:type="table" w:styleId="101">
     <w:name w:val="Medium Grid 3 Accent 4"/>
     <w:basedOn w:val="32"/>
+    <w:qFormat/>
     <w:uiPriority w:val="69"/>
     <w:pPr>
       <w:spacing w:after="0" w:line="240" w:lineRule="auto"/>
@@ -26613,6 +26588,7 @@
   <w:style w:type="table" w:styleId="102">
     <w:name w:val="Medium Grid 3 Accent 5"/>
     <w:basedOn w:val="32"/>
+    <w:qFormat/>
     <w:uiPriority w:val="69"/>
     <w:pPr>
       <w:spacing w:after="0" w:line="240" w:lineRule="auto"/>
@@ -26770,6 +26746,7 @@
   <w:style w:type="table" w:styleId="103">
     <w:name w:val="Medium Grid 3 Accent 6"/>
     <w:basedOn w:val="32"/>
+    <w:qFormat/>
     <w:uiPriority w:val="69"/>
     <w:pPr>
       <w:spacing w:after="0" w:line="240" w:lineRule="auto"/>
@@ -26927,6 +26904,7 @@
   <w:style w:type="table" w:styleId="104">
     <w:name w:val="Dark List"/>
     <w:basedOn w:val="32"/>
+    <w:qFormat/>
     <w:uiPriority w:val="70"/>
     <w:pPr>
       <w:spacing w:after="0" w:line="240" w:lineRule="auto"/>
@@ -27042,6 +27020,7 @@
   <w:style w:type="table" w:styleId="105">
     <w:name w:val="Dark List Accent 1"/>
     <w:basedOn w:val="32"/>
+    <w:qFormat/>
     <w:uiPriority w:val="70"/>
     <w:pPr>
       <w:spacing w:after="0" w:line="240" w:lineRule="auto"/>
@@ -27157,6 +27136,7 @@
   <w:style w:type="table" w:styleId="106">
     <w:name w:val="Dark List Accent 2"/>
     <w:basedOn w:val="32"/>
+    <w:qFormat/>
     <w:uiPriority w:val="70"/>
     <w:pPr>
       <w:spacing w:after="0" w:line="240" w:lineRule="auto"/>
@@ -27272,6 +27252,7 @@
   <w:style w:type="table" w:styleId="107">
     <w:name w:val="Dark List Accent 3"/>
     <w:basedOn w:val="32"/>
+    <w:qFormat/>
     <w:uiPriority w:val="70"/>
     <w:pPr>
       <w:spacing w:after="0" w:line="240" w:lineRule="auto"/>
@@ -27387,6 +27368,7 @@
   <w:style w:type="table" w:styleId="108">
     <w:name w:val="Dark List Accent 4"/>
     <w:basedOn w:val="32"/>
+    <w:qFormat/>
     <w:uiPriority w:val="70"/>
     <w:pPr>
       <w:spacing w:after="0" w:line="240" w:lineRule="auto"/>
@@ -27502,6 +27484,7 @@
   <w:style w:type="table" w:styleId="109">
     <w:name w:val="Dark List Accent 5"/>
     <w:basedOn w:val="32"/>
+    <w:qFormat/>
     <w:uiPriority w:val="70"/>
     <w:pPr>
       <w:spacing w:after="0" w:line="240" w:lineRule="auto"/>
@@ -27617,6 +27600,7 @@
   <w:style w:type="table" w:styleId="110">
     <w:name w:val="Dark List Accent 6"/>
     <w:basedOn w:val="32"/>
+    <w:qFormat/>
     <w:uiPriority w:val="70"/>
     <w:pPr>
       <w:spacing w:after="0" w:line="240" w:lineRule="auto"/>
@@ -27732,6 +27716,7 @@
   <w:style w:type="table" w:styleId="111">
     <w:name w:val="Colorful Shading"/>
     <w:basedOn w:val="32"/>
+    <w:qFormat/>
     <w:uiPriority w:val="71"/>
     <w:pPr>
       <w:spacing w:after="0" w:line="240" w:lineRule="auto"/>
@@ -28028,6 +28013,7 @@
   <w:style w:type="table" w:styleId="113">
     <w:name w:val="Colorful Shading Accent 2"/>
     <w:basedOn w:val="32"/>
+    <w:qFormat/>
     <w:uiPriority w:val="71"/>
     <w:pPr>
       <w:spacing w:after="0" w:line="240" w:lineRule="auto"/>
@@ -28176,6 +28162,7 @@
   <w:style w:type="table" w:styleId="114">
     <w:name w:val="Colorful Shading Accent 3"/>
     <w:basedOn w:val="32"/>
+    <w:qFormat/>
     <w:uiPriority w:val="71"/>
     <w:pPr>
       <w:spacing w:after="0" w:line="240" w:lineRule="auto"/>
@@ -28749,6 +28736,7 @@
   <w:style w:type="table" w:styleId="118">
     <w:name w:val="Colorful List"/>
     <w:basedOn w:val="32"/>
+    <w:qFormat/>
     <w:uiPriority w:val="72"/>
     <w:pPr>
       <w:spacing w:after="0" w:line="240" w:lineRule="auto"/>

</xml_diff>